<commit_message>
OMG. Put back web.infrastructure redirect
</commit_message>
<xml_diff>
--- a/docs/upgrades/Sage300SDK_2026_0UpgradeGuide.docx
+++ b/docs/upgrades/Sage300SDK_2026_0UpgradeGuide.docx
@@ -73,7 +73,7 @@
         </w:sectPr>
       </w:pPr>
       <w:r>
-        <w:t>September</w:t>
+        <w:t>November</w:t>
       </w:r>
       <w:r>
         <w:t xml:space="preserve"> 202</w:t>
@@ -1561,7 +1561,13 @@
           <w:rPr>
             <w:webHidden/>
           </w:rPr>
-          <w:t>15</w:t>
+          <w:t>1</w:t>
+        </w:r>
+        <w:r>
+          <w:rPr>
+            <w:webHidden/>
+          </w:rPr>
+          <w:t>5</w:t>
         </w:r>
         <w:r>
           <w:rPr>
@@ -5438,7 +5444,7 @@
           <w:noProof/>
         </w:rPr>
         <w:drawing>
-          <wp:inline distT="0" distB="0" distL="0" distR="0" wp14:anchorId="6F0A43BA" wp14:editId="0A51B807">
+          <wp:inline distT="0" distB="0" distL="0" distR="0" wp14:anchorId="6F0A43BA" wp14:editId="3A3F0590">
             <wp:extent cx="5210175" cy="958876"/>
             <wp:effectExtent l="0" t="0" r="0" b="0"/>
             <wp:docPr id="1073917985" name="Picture 10"/>
@@ -6238,7 +6244,7 @@
           <w:noProof/>
         </w:rPr>
         <w:drawing>
-          <wp:inline distT="0" distB="0" distL="0" distR="0" wp14:anchorId="0C4BAEB9" wp14:editId="3CCC7282">
+          <wp:inline distT="0" distB="0" distL="0" distR="0" wp14:anchorId="0C4BAEB9" wp14:editId="30A4B84C">
             <wp:extent cx="5210175" cy="958876"/>
             <wp:effectExtent l="0" t="0" r="0" b="0"/>
             <wp:docPr id="1682424461" name="Picture 10" descr="A screenshot of a computer&#10;&#10;AI-generated content may be incorrect."/>
@@ -23810,10 +23816,7 @@
         <w:pStyle w:val="SAGEBodyText"/>
       </w:pPr>
       <w:r>
-        <w:t xml:space="preserve">6. </w:t>
-      </w:r>
-      <w:r>
-        <w:t>Modify the Post Build Event in the Web Project</w:t>
+        <w:t>6. Modify the Post Build Event in the Web Project</w:t>
       </w:r>
     </w:p>
     <w:p>
@@ -24208,7 +24211,7 @@
           <w:noProof/>
         </w:rPr>
         <w:drawing>
-          <wp:inline distT="0" distB="0" distL="0" distR="0" wp14:anchorId="391925B2" wp14:editId="0CCBECB6">
+          <wp:inline distT="0" distB="0" distL="0" distR="0" wp14:anchorId="391925B2" wp14:editId="702E05E3">
             <wp:extent cx="5852160" cy="1607820"/>
             <wp:effectExtent l="0" t="0" r="0" b="0"/>
             <wp:docPr id="342273712" name="Picture 1"/>
@@ -24957,7 +24960,7 @@
           <w:noProof/>
         </w:rPr>
         <w:drawing>
-          <wp:inline distT="0" distB="0" distL="0" distR="0" wp14:anchorId="018D0DDD" wp14:editId="61E8D8A7">
+          <wp:inline distT="0" distB="0" distL="0" distR="0" wp14:anchorId="018D0DDD" wp14:editId="2AD60942">
             <wp:extent cx="5838825" cy="1495425"/>
             <wp:effectExtent l="0" t="0" r="9525" b="9525"/>
             <wp:docPr id="841312830" name="Picture 9"/>
@@ -26040,7 +26043,7 @@
         <v:path o:extrusionok="f" gradientshapeok="t" o:connecttype="rect"/>
         <o:lock v:ext="edit" aspectratio="t"/>
       </v:shapetype>
-      <v:shape id="_x0000_i1035" type="#_x0000_t75" style="width:20.1pt;height:20.1pt;visibility:visible;mso-wrap-style:square" o:bullet="t">
+      <v:shape id="_x0000_i1030" type="#_x0000_t75" style="width:21.6pt;height:21.6pt;visibility:visible;mso-wrap-style:square" o:bullet="t">
         <v:imagedata r:id="rId1" o:title=""/>
       </v:shape>
     </w:pict>

</xml_diff>